<commit_message>
update Six Months Stay Review
</commit_message>
<xml_diff>
--- a/Document/Tài liệu mô tả Smartsam.docx
+++ b/Document/Tài liệu mô tả Smartsam.docx
@@ -970,8 +970,18 @@
         </w:rPr>
         <w:t>ví dụ như thêm mới, và các hành động khác</w:t>
       </w:r>
-      <w:bookmarkStart w:id="0" w:name="_GoBack"/>
-      <w:bookmarkEnd w:id="0"/>
+    </w:p>
+    <w:p>
+      <w:pPr>
+        <w:pStyle w:val="NoSpacing"/>
+        <w:numPr>
+          <w:ilvl w:val="1"/>
+          <w:numId w:val="8"/>
+        </w:numPr>
+        <w:rPr>
+          <w:szCs w:val="24"/>
+        </w:rPr>
+      </w:pPr>
     </w:p>
     <w:p>
       <w:pPr>
@@ -984,59 +994,147 @@
           <w:szCs w:val="24"/>
         </w:rPr>
       </w:pPr>
-    </w:p>
-    <w:p>
-      <w:pPr>
-        <w:pStyle w:val="NoSpacing"/>
-        <w:ind w:left="360"/>
+      <w:r>
         <w:rPr>
           <w:szCs w:val="24"/>
         </w:rPr>
-      </w:pPr>
-      <w:r>
-        <w:rPr>
-          <w:szCs w:val="24"/>
-        </w:rPr>
-        <w:t xml:space="preserve">Step2: Thang đến, vào trong thang, quẹt thẻ -&gt; nghe tiếng “pip”, bấm số tầng cần đến. </w:t>
-      </w:r>
-      <w:r>
-        <w:rPr>
-          <w:szCs w:val="24"/>
-        </w:rPr>
-        <w:br/>
-      </w:r>
-      <w:r>
-        <w:rPr>
-          <w:color w:val="FF0000"/>
-          <w:szCs w:val="24"/>
-        </w:rPr>
-        <w:t>Nếu quẹt thẻ không kêu-&gt; liên hệ bộ phận phụ trách</w:t>
-      </w:r>
-      <w:r>
-        <w:rPr>
-          <w:szCs w:val="24"/>
-        </w:rPr>
-        <w:t>(AD phụ trách thẻ nhân viên, CSD phụ trách các thẻ còn lại)</w:t>
-      </w:r>
-    </w:p>
-    <w:p>
-      <w:pPr>
-        <w:pStyle w:val="NoSpacing"/>
-        <w:ind w:left="360"/>
-        <w:rPr>
-          <w:szCs w:val="24"/>
-        </w:rPr>
+        <w:t>Xx</w:t>
+      </w:r>
+    </w:p>
+    <w:p>
+      <w:pPr>
+        <w:pStyle w:val="Heading1"/>
+        <w:numPr>
+          <w:ilvl w:val="0"/>
+          <w:numId w:val="4"/>
+        </w:numPr>
+      </w:pPr>
+      <w:r>
+        <w:t>CHI TIẾT CÁC MODULE</w:t>
+      </w:r>
+    </w:p>
+    <w:p>
+      <w:pPr>
+        <w:pStyle w:val="Heading2"/>
+        <w:numPr>
+          <w:ilvl w:val="0"/>
+          <w:numId w:val="11"/>
+        </w:numPr>
+      </w:pPr>
+      <w:r>
+        <w:lastRenderedPageBreak/>
+        <w:t>APARTMENT</w:t>
+      </w:r>
+    </w:p>
+    <w:p>
+      <w:pPr>
+        <w:pStyle w:val="Heading2"/>
+        <w:numPr>
+          <w:ilvl w:val="0"/>
+          <w:numId w:val="11"/>
+        </w:numPr>
+      </w:pPr>
+      <w:r>
+        <w:t>SALES</w:t>
+      </w:r>
+    </w:p>
+    <w:p>
+      <w:pPr>
+        <w:pStyle w:val="Heading2"/>
+        <w:numPr>
+          <w:ilvl w:val="0"/>
+          <w:numId w:val="11"/>
+        </w:numPr>
+      </w:pPr>
+      <w:r>
+        <w:t xml:space="preserve">CUSTOMER SERVICES </w:t>
+      </w:r>
+    </w:p>
+    <w:p>
+      <w:pPr>
+        <w:pStyle w:val="Heading2"/>
+        <w:numPr>
+          <w:ilvl w:val="0"/>
+          <w:numId w:val="11"/>
+        </w:numPr>
+      </w:pPr>
+      <w:r>
+        <w:t>INFOR CENTER</w:t>
+      </w:r>
+    </w:p>
+    <w:p>
+      <w:pPr>
+        <w:pStyle w:val="Heading2"/>
+        <w:numPr>
+          <w:ilvl w:val="0"/>
+          <w:numId w:val="11"/>
+        </w:numPr>
+      </w:pPr>
+      <w:r>
+        <w:t>INVENTORY</w:t>
+      </w:r>
+    </w:p>
+    <w:p>
+      <w:pPr>
+        <w:pStyle w:val="Heading2"/>
+        <w:numPr>
+          <w:ilvl w:val="0"/>
+          <w:numId w:val="11"/>
+        </w:numPr>
+      </w:pPr>
+      <w:r>
+        <w:t>PURCHASING</w:t>
+      </w:r>
+    </w:p>
+    <w:p>
+      <w:pPr>
+        <w:pStyle w:val="ListParagraph"/>
+        <w:numPr>
+          <w:ilvl w:val="0"/>
+          <w:numId w:val="12"/>
+        </w:numPr>
+      </w:pPr>
+      <w:r>
+        <w:t xml:space="preserve">SUPPLIER </w:t>
+      </w:r>
+    </w:p>
+    <w:p>
+      <w:pPr>
+        <w:pStyle w:val="ListParagraph"/>
+        <w:numPr>
+          <w:ilvl w:val="0"/>
+          <w:numId w:val="12"/>
+        </w:numPr>
+      </w:pPr>
+      <w:r>
+        <w:t>APPROVE SUPPLIER ANUALLY</w:t>
+      </w:r>
+    </w:p>
+    <w:p>
+      <w:pPr>
+        <w:pStyle w:val="ListParagraph"/>
+        <w:numPr>
+          <w:ilvl w:val="0"/>
+          <w:numId w:val="12"/>
+        </w:numPr>
+      </w:pPr>
+      <w:r>
+        <w:t>MATERIAL REQUEST</w:t>
+      </w:r>
+    </w:p>
+    <w:p>
+      <w:pPr>
+        <w:pStyle w:val="ListParagraph"/>
       </w:pPr>
       <w:r>
         <w:rPr>
           <w:noProof/>
         </w:rPr>
-        <w:lastRenderedPageBreak/>
         <w:drawing>
-          <wp:inline distT="0" distB="0" distL="0" distR="0" wp14:anchorId="33D2418A" wp14:editId="72B1C87C">
-            <wp:extent cx="4970145" cy="2372995"/>
-            <wp:effectExtent l="0" t="0" r="1905" b="8255"/>
-            <wp:docPr id="13" name="Picture 13"/>
+          <wp:inline distT="0" distB="0" distL="0" distR="0" wp14:anchorId="40C72DC6" wp14:editId="332C15B5">
+            <wp:extent cx="5943600" cy="1830705"/>
+            <wp:effectExtent l="0" t="0" r="0" b="0"/>
+            <wp:docPr id="1" name="Picture 1"/>
             <wp:cNvGraphicFramePr>
               <a:graphicFrameLocks xmlns:a="http://schemas.openxmlformats.org/drawingml/2006/main" noChangeAspect="1"/>
             </wp:cNvGraphicFramePr>
@@ -1044,36 +1142,23 @@
               <a:graphicData uri="http://schemas.openxmlformats.org/drawingml/2006/picture">
                 <pic:pic xmlns:pic="http://schemas.openxmlformats.org/drawingml/2006/picture">
                   <pic:nvPicPr>
-                    <pic:cNvPr id="0" name="Picture 7"/>
-                    <pic:cNvPicPr>
-                      <a:picLocks noChangeAspect="1" noChangeArrowheads="1"/>
-                    </pic:cNvPicPr>
+                    <pic:cNvPr id="1" name=""/>
+                    <pic:cNvPicPr/>
                   </pic:nvPicPr>
                   <pic:blipFill>
-                    <a:blip r:embed="rId9">
-                      <a:extLst>
-                        <a:ext uri="{28A0092B-C50C-407E-A947-70E740481C1C}">
-                          <a14:useLocalDpi xmlns:a14="http://schemas.microsoft.com/office/drawing/2010/main" val="0"/>
-                        </a:ext>
-                      </a:extLst>
-                    </a:blip>
-                    <a:srcRect/>
+                    <a:blip r:embed="rId9"/>
                     <a:stretch>
                       <a:fillRect/>
                     </a:stretch>
                   </pic:blipFill>
-                  <pic:spPr bwMode="auto">
+                  <pic:spPr>
                     <a:xfrm>
                       <a:off x="0" y="0"/>
-                      <a:ext cx="4970145" cy="2372995"/>
+                      <a:ext cx="5943600" cy="1830705"/>
                     </a:xfrm>
                     <a:prstGeom prst="rect">
                       <a:avLst/>
                     </a:prstGeom>
-                    <a:noFill/>
-                    <a:ln>
-                      <a:noFill/>
-                    </a:ln>
                   </pic:spPr>
                 </pic:pic>
               </a:graphicData>
@@ -1084,485 +1169,310 @@
     </w:p>
     <w:p>
       <w:pPr>
-        <w:pStyle w:val="NoSpacing"/>
+        <w:pStyle w:val="ListParagraph"/>
         <w:numPr>
           <w:ilvl w:val="0"/>
-          <w:numId w:val="5"/>
+          <w:numId w:val="13"/>
         </w:numPr>
-        <w:spacing w:before="0"/>
-        <w:rPr>
-          <w:szCs w:val="24"/>
-        </w:rPr>
-      </w:pPr>
-      <w:r>
-        <w:rPr>
-          <w:szCs w:val="24"/>
-        </w:rPr>
-        <w:t>Hình 1 : Vị trí lắp đầu đọc thẻ</w:t>
-      </w:r>
-    </w:p>
-    <w:p>
-      <w:pPr>
-        <w:pStyle w:val="NoSpacing"/>
+      </w:pPr>
+      <w:r>
+        <w:t>Khi có nhu cầu sử dụng hàng hóa hoặc dịch vụ gì , nhân viên tạo Material Request</w:t>
+      </w:r>
+      <w:r>
+        <w:t>(MR)</w:t>
+      </w:r>
+      <w:r>
+        <w:t xml:space="preserve">, hệ thống gửi mail đến trưởng bộ phận, nếu là trưởng bộ phận </w:t>
+      </w:r>
+      <w:r>
+        <w:t xml:space="preserve">chính là người </w:t>
+      </w:r>
+      <w:r>
+        <w:t xml:space="preserve">tạo yêu cầu thì trưởng bộ phận có thể approve luôn sau khi submit. </w:t>
+      </w:r>
+      <w:r>
+        <w:br/>
+      </w:r>
+      <w:r>
+        <w:t>*</w:t>
+      </w:r>
+      <w:r>
+        <w:t xml:space="preserve">Lưu ý: </w:t>
+      </w:r>
+    </w:p>
+    <w:p>
+      <w:pPr>
+        <w:pStyle w:val="ListParagraph"/>
+        <w:numPr>
+          <w:ilvl w:val="1"/>
+          <w:numId w:val="13"/>
+        </w:numPr>
+        <w:rPr>
+          <w:i/>
+        </w:rPr>
+      </w:pPr>
+      <w:r>
+        <w:rPr>
+          <w:i/>
+        </w:rPr>
+        <w:t xml:space="preserve">Có </w:t>
+      </w:r>
+      <w:r>
+        <w:rPr>
+          <w:i/>
+        </w:rPr>
+        <w:t>2</w:t>
+      </w:r>
+      <w:r>
+        <w:rPr>
+          <w:i/>
+        </w:rPr>
+        <w:t xml:space="preserve"> loại yêu cầu</w:t>
+      </w:r>
+      <w:r>
+        <w:rPr>
+          <w:i/>
+        </w:rPr>
+        <w:t xml:space="preserve"> chính</w:t>
+      </w:r>
+      <w:r>
+        <w:rPr>
+          <w:i/>
+        </w:rPr>
+        <w:t>:</w:t>
+      </w:r>
+      <w:r>
+        <w:rPr>
+          <w:i/>
+        </w:rPr>
+        <w:br/>
+        <w:t>-</w:t>
+      </w:r>
+      <w:r>
+        <w:rPr>
+          <w:i/>
+        </w:rPr>
+        <w:t xml:space="preserve"> </w:t>
+      </w:r>
+      <w:r>
+        <w:rPr>
+          <w:i/>
+        </w:rPr>
+        <w:t xml:space="preserve">Yêu cầu </w:t>
+      </w:r>
+      <w:r>
+        <w:rPr>
+          <w:i/>
+        </w:rPr>
+        <w:t xml:space="preserve">thông thường là </w:t>
+      </w:r>
+      <w:r>
+        <w:rPr>
+          <w:i/>
+        </w:rPr>
+        <w:t>khi nào cần thì tạo khi đó</w:t>
+      </w:r>
+      <w:r>
+        <w:rPr>
+          <w:i/>
+        </w:rPr>
+        <w:t>, loại này được chia làm 2 loại nhỏ(Not Issue</w:t>
+      </w:r>
+      <w:r>
+        <w:rPr>
+          <w:i/>
+        </w:rPr>
+        <w:t xml:space="preserve"> hoặc ngược lại</w:t>
+      </w:r>
+      <w:r>
+        <w:rPr>
+          <w:i/>
+        </w:rPr>
+        <w:t>)</w:t>
+      </w:r>
+    </w:p>
+    <w:p>
+      <w:pPr>
+        <w:pStyle w:val="ListParagraph"/>
+        <w:ind w:left="1800"/>
+        <w:rPr>
+          <w:i/>
+        </w:rPr>
+      </w:pPr>
+      <w:r>
+        <w:rPr>
+          <w:i/>
+        </w:rPr>
+        <w:t xml:space="preserve">-  Yêu cầu </w:t>
+      </w:r>
+      <w:r>
+        <w:rPr>
+          <w:i/>
+        </w:rPr>
+        <w:t>theo định mức, loại này 1 tháng chỉ được làm một lần và người phụ trách kho của bộ phận mới được tạo</w:t>
+      </w:r>
+      <w:r>
+        <w:rPr>
+          <w:i/>
+        </w:rPr>
+        <w:t>(Trường IsInventoryControlInDep trong table MS_Employee , trường StoreGR chính là nhóm kho mà người đó thuộc về)</w:t>
+      </w:r>
+    </w:p>
+    <w:p>
+      <w:pPr>
+        <w:pStyle w:val="ListParagraph"/>
+        <w:numPr>
+          <w:ilvl w:val="1"/>
+          <w:numId w:val="13"/>
+        </w:numPr>
+        <w:rPr>
+          <w:i/>
+        </w:rPr>
+      </w:pPr>
+      <w:r>
+        <w:rPr>
+          <w:i/>
+        </w:rPr>
+        <w:t>Tìm mail trưởng bộ phận. Trường HeadDept trong table MS_Employee cho biết trưởng bộ phận, trưởng StoreGR cho biết cùng nhóm kho với người tạo MR</w:t>
+      </w:r>
+    </w:p>
+    <w:p>
+      <w:pPr>
+        <w:pStyle w:val="ListParagraph"/>
+        <w:ind w:left="1800"/>
+      </w:pPr>
+    </w:p>
+    <w:p>
+      <w:pPr>
+        <w:pStyle w:val="ListParagraph"/>
         <w:numPr>
           <w:ilvl w:val="0"/>
-          <w:numId w:val="5"/>
+          <w:numId w:val="13"/>
         </w:numPr>
-        <w:spacing w:before="0"/>
-        <w:rPr>
-          <w:szCs w:val="24"/>
-        </w:rPr>
-      </w:pPr>
-      <w:r>
-        <w:rPr>
-          <w:szCs w:val="24"/>
-        </w:rPr>
-        <w:t>Hình 2 : Để thẻ vào vị trí lắp đầu đọc thẻ</w:t>
-      </w:r>
-    </w:p>
-    <w:p>
-      <w:pPr>
-        <w:pStyle w:val="NoSpacing"/>
+      </w:pPr>
+      <w:r>
+        <w:t xml:space="preserve">Trưởng bộ phận sẽ căn cứ vào thực tế để thực hiện phê duyệt , nhấp vào link gửi trong mail sẽ mở ra chi tiết </w:t>
+      </w:r>
+      <w:r>
+        <w:t>, nhấn vào nút Approve hoặc Reject</w:t>
+      </w:r>
+      <w:r>
+        <w:t>, nếu Reject thì</w:t>
+      </w:r>
+      <w:r>
+        <w:t xml:space="preserve"> điền lý do</w:t>
+      </w:r>
+      <w:r>
+        <w:t>(Reject từng item/Service)</w:t>
+      </w:r>
+      <w:r>
+        <w:t>. Nếu Approve thì hệ thống thông báo đến Purchser. Nếu</w:t>
+      </w:r>
+      <w:r>
+        <w:t xml:space="preserve"> Reject thì hệ thống thông báo đến người tạo</w:t>
+      </w:r>
+      <w:r>
+        <w:t>(từng item)</w:t>
+      </w:r>
+      <w:r>
+        <w:t xml:space="preserve">. </w:t>
+      </w:r>
+      <w:r>
+        <w:t xml:space="preserve">Tìm email của Purchaser trong </w:t>
+      </w:r>
+      <w:r>
+        <w:rPr>
+          <w:i/>
+        </w:rPr>
+        <w:t>Employee</w:t>
+      </w:r>
+      <w:r>
+        <w:rPr>
+          <w:i/>
+        </w:rPr>
+        <w:t xml:space="preserve"> với điều kiện IsPachaser =1</w:t>
+      </w:r>
+    </w:p>
+    <w:p>
+      <w:pPr>
+        <w:pStyle w:val="ListParagraph"/>
         <w:numPr>
           <w:ilvl w:val="0"/>
-          <w:numId w:val="5"/>
+          <w:numId w:val="13"/>
         </w:numPr>
-        <w:spacing w:before="0"/>
-        <w:rPr>
-          <w:szCs w:val="24"/>
-        </w:rPr>
-      </w:pPr>
-      <w:r>
-        <w:rPr>
-          <w:szCs w:val="24"/>
-        </w:rPr>
-        <w:t>Hình 3 : Nhấn nút tầng cần đi</w:t>
-      </w:r>
-    </w:p>
-    <w:p>
-      <w:pPr>
-        <w:pStyle w:val="Heading1"/>
+      </w:pPr>
+      <w:r>
+        <w:lastRenderedPageBreak/>
+        <w:t>Purchaser nhận được email sẽ click vào link trong mail mở ra page Material Request Detail, nhấn vào nút Caculate</w:t>
+      </w:r>
+      <w:r>
+        <w:t>=&gt; Tính ra số lượng hàng cần mua</w:t>
+      </w:r>
+      <w:r>
+        <w:t xml:space="preserve">( Anh </w:t>
+      </w:r>
+      <w:r>
+        <w:t>sẽ cung cấp hàm này</w:t>
+      </w:r>
+      <w:r>
+        <w:t>)</w:t>
+      </w:r>
+      <w:r>
+        <w:t>, có thể Reject 1 số item, sau đó approve để hệ thống gửi lên CFO</w:t>
+      </w:r>
+      <w:r>
+        <w:t>(IsCFO trong MS_Employee)</w:t>
+      </w:r>
+    </w:p>
+    <w:p>
+      <w:pPr>
+        <w:pStyle w:val="ListParagraph"/>
         <w:numPr>
           <w:ilvl w:val="0"/>
-          <w:numId w:val="4"/>
+          <w:numId w:val="13"/>
         </w:numPr>
       </w:pPr>
-      <w:bookmarkStart w:id="1" w:name="_Toc194587193"/>
-      <w:r>
-        <w:t>ĐỐI VỚI NHÂN VIÊN KỸ THUẬT</w:t>
-      </w:r>
-      <w:bookmarkEnd w:id="1"/>
-      <w:r>
-        <w:t xml:space="preserve"> </w:t>
-      </w:r>
-    </w:p>
-    <w:p>
-      <w:pPr>
-        <w:ind w:left="360"/>
+      <w:r>
+        <w:t>CFO làm tương tự</w:t>
+      </w:r>
+    </w:p>
+    <w:p>
+      <w:pPr>
+        <w:pStyle w:val="ListParagraph"/>
+        <w:ind w:left="1080"/>
+      </w:pPr>
+    </w:p>
+    <w:p>
+      <w:pPr>
+        <w:pStyle w:val="ListParagraph"/>
+        <w:ind w:left="1080"/>
+      </w:pPr>
+      <w:r>
+        <w:t>Giao diện màn hình như sau:</w:t>
+      </w:r>
+    </w:p>
+    <w:p>
+      <w:pPr>
+        <w:pStyle w:val="ListParagraph"/>
+        <w:ind w:left="1080"/>
+      </w:pPr>
+      <w:r>
+        <w:t>Matertail Request</w:t>
+      </w:r>
+    </w:p>
+    <w:p>
+      <w:pPr>
+        <w:pStyle w:val="ListParagraph"/>
+        <w:ind w:left="1080"/>
       </w:pPr>
       <w:r>
         <w:rPr>
           <w:noProof/>
         </w:rPr>
         <w:drawing>
-          <wp:inline distT="0" distB="0" distL="0" distR="0" wp14:anchorId="692FD51E" wp14:editId="78B77546">
-            <wp:extent cx="3517265" cy="2810510"/>
-            <wp:effectExtent l="0" t="0" r="6985" b="8890"/>
-            <wp:docPr id="14" name="Picture 14"/>
-            <wp:cNvGraphicFramePr>
-              <a:graphicFrameLocks xmlns:a="http://schemas.openxmlformats.org/drawingml/2006/main" noChangeAspect="1"/>
-            </wp:cNvGraphicFramePr>
-            <a:graphic xmlns:a="http://schemas.openxmlformats.org/drawingml/2006/main">
-              <a:graphicData uri="http://schemas.openxmlformats.org/drawingml/2006/picture">
-                <pic:pic xmlns:pic="http://schemas.openxmlformats.org/drawingml/2006/picture">
-                  <pic:nvPicPr>
-                    <pic:cNvPr id="0" name="Picture 9"/>
-                    <pic:cNvPicPr>
-                      <a:picLocks noChangeAspect="1" noChangeArrowheads="1"/>
-                    </pic:cNvPicPr>
-                  </pic:nvPicPr>
-                  <pic:blipFill>
-                    <a:blip r:embed="rId10">
-                      <a:extLst>
-                        <a:ext uri="{28A0092B-C50C-407E-A947-70E740481C1C}">
-                          <a14:useLocalDpi xmlns:a14="http://schemas.microsoft.com/office/drawing/2010/main" val="0"/>
-                        </a:ext>
-                      </a:extLst>
-                    </a:blip>
-                    <a:srcRect/>
-                    <a:stretch>
-                      <a:fillRect/>
-                    </a:stretch>
-                  </pic:blipFill>
-                  <pic:spPr bwMode="auto">
-                    <a:xfrm>
-                      <a:off x="0" y="0"/>
-                      <a:ext cx="3517265" cy="2810510"/>
-                    </a:xfrm>
-                    <a:prstGeom prst="rect">
-                      <a:avLst/>
-                    </a:prstGeom>
-                    <a:noFill/>
-                    <a:ln>
-                      <a:noFill/>
-                    </a:ln>
-                  </pic:spPr>
-                </pic:pic>
-              </a:graphicData>
-            </a:graphic>
-          </wp:inline>
-        </w:drawing>
-      </w:r>
-    </w:p>
-    <w:p>
-      <w:pPr>
-        <w:pStyle w:val="NoSpacing"/>
-        <w:ind w:firstLine="360"/>
-        <w:rPr>
-          <w:szCs w:val="24"/>
-        </w:rPr>
-      </w:pPr>
-      <w:r>
-        <w:rPr>
-          <w:szCs w:val="24"/>
-        </w:rPr>
-        <w:t xml:space="preserve">Trong thang máy </w:t>
-      </w:r>
-      <w:r>
-        <w:rPr>
-          <w:szCs w:val="24"/>
-        </w:rPr>
-        <w:t>có</w:t>
-      </w:r>
-      <w:r>
-        <w:rPr>
-          <w:szCs w:val="24"/>
-        </w:rPr>
-        <w:t xml:space="preserve"> công tắc của hệ thống thẻ từ</w:t>
-      </w:r>
-      <w:r>
-        <w:rPr>
-          <w:szCs w:val="24"/>
-        </w:rPr>
-        <w:t xml:space="preserve"> nằm trong cabin vị trí hộp kỹ thuật</w:t>
-      </w:r>
-    </w:p>
-    <w:p>
-      <w:pPr>
-        <w:pStyle w:val="NoSpacing"/>
-        <w:numPr>
-          <w:ilvl w:val="0"/>
-          <w:numId w:val="5"/>
-        </w:numPr>
-        <w:spacing w:before="0"/>
-        <w:rPr>
-          <w:szCs w:val="24"/>
-        </w:rPr>
-      </w:pPr>
-      <w:r>
-        <w:rPr>
-          <w:color w:val="FF0000"/>
-          <w:szCs w:val="24"/>
-        </w:rPr>
-        <w:t>Khi công tắc ở vị trí OFF</w:t>
-      </w:r>
-      <w:r>
-        <w:rPr>
-          <w:szCs w:val="24"/>
-        </w:rPr>
-        <w:t xml:space="preserve"> : tất cả các nút gọi tầng bên trong đều nhấn được bình thường </w:t>
-      </w:r>
-    </w:p>
-    <w:p>
-      <w:pPr>
-        <w:pStyle w:val="NoSpacing"/>
-        <w:numPr>
-          <w:ilvl w:val="0"/>
-          <w:numId w:val="5"/>
-        </w:numPr>
-        <w:spacing w:before="0"/>
-        <w:rPr>
-          <w:szCs w:val="24"/>
-        </w:rPr>
-      </w:pPr>
-      <w:r>
-        <w:rPr>
-          <w:color w:val="FF0000"/>
-          <w:szCs w:val="24"/>
-        </w:rPr>
-        <w:t>Khi công tắc ở vị trí ON</w:t>
-      </w:r>
-      <w:r>
-        <w:rPr>
-          <w:szCs w:val="24"/>
-        </w:rPr>
-        <w:t xml:space="preserve"> : tất cả các nút gọi tầng bên trong</w:t>
-      </w:r>
-      <w:r>
-        <w:rPr>
-          <w:szCs w:val="24"/>
-        </w:rPr>
-        <w:t xml:space="preserve"> (</w:t>
-      </w:r>
-      <w:r>
-        <w:rPr>
-          <w:b/>
-          <w:color w:val="FF0000"/>
-          <w:sz w:val="20"/>
-          <w:szCs w:val="20"/>
-        </w:rPr>
-        <w:t>TRỪ</w:t>
-      </w:r>
-      <w:r>
-        <w:rPr>
-          <w:b/>
-          <w:color w:val="FF0000"/>
-          <w:sz w:val="20"/>
-          <w:szCs w:val="20"/>
-        </w:rPr>
-        <w:t xml:space="preserve"> B,1</w:t>
-      </w:r>
-      <w:r>
-        <w:rPr>
-          <w:szCs w:val="24"/>
-        </w:rPr>
-        <w:t>)</w:t>
-      </w:r>
-      <w:r>
-        <w:rPr>
-          <w:szCs w:val="24"/>
-        </w:rPr>
-        <w:t xml:space="preserve"> đều bị khóa (kh</w:t>
-      </w:r>
-      <w:r>
-        <w:rPr>
-          <w:szCs w:val="24"/>
-        </w:rPr>
-        <w:t>ô</w:t>
-      </w:r>
-      <w:r>
-        <w:rPr>
-          <w:szCs w:val="24"/>
-        </w:rPr>
-        <w:t>ng nhấn được) (Phải quẹt thẻ mới nhấn được nút gọi)</w:t>
-      </w:r>
-    </w:p>
-    <w:p>
-      <w:pPr>
-        <w:pStyle w:val="NoSpacing"/>
-        <w:numPr>
-          <w:ilvl w:val="0"/>
-          <w:numId w:val="5"/>
-        </w:numPr>
-        <w:rPr>
-          <w:szCs w:val="24"/>
-        </w:rPr>
-      </w:pPr>
-      <w:r>
-        <w:rPr>
-          <w:szCs w:val="24"/>
-        </w:rPr>
-        <w:t>Vị trí lắp thiết bị</w:t>
-      </w:r>
-      <w:r>
-        <w:rPr>
-          <w:szCs w:val="24"/>
-        </w:rPr>
-        <w:t xml:space="preserve"> và dây tín hiệu</w:t>
-      </w:r>
-    </w:p>
-    <w:p>
-      <w:pPr>
-        <w:pStyle w:val="ListParagraph"/>
-      </w:pPr>
-      <w:r>
-        <w:rPr>
-          <w:noProof/>
-        </w:rPr>
-        <w:lastRenderedPageBreak/>
-        <w:drawing>
-          <wp:inline distT="0" distB="0" distL="0" distR="0" wp14:anchorId="77FD956D" wp14:editId="7FA4E9A7">
-            <wp:extent cx="2047875" cy="2327910"/>
-            <wp:effectExtent l="0" t="0" r="9525" b="0"/>
-            <wp:docPr id="15" name="Picture 15"/>
-            <wp:cNvGraphicFramePr>
-              <a:graphicFrameLocks xmlns:a="http://schemas.openxmlformats.org/drawingml/2006/main" noChangeAspect="1"/>
-            </wp:cNvGraphicFramePr>
-            <a:graphic xmlns:a="http://schemas.openxmlformats.org/drawingml/2006/main">
-              <a:graphicData uri="http://schemas.openxmlformats.org/drawingml/2006/picture">
-                <pic:pic xmlns:pic="http://schemas.openxmlformats.org/drawingml/2006/picture">
-                  <pic:nvPicPr>
-                    <pic:cNvPr id="0" name="Picture 11"/>
-                    <pic:cNvPicPr>
-                      <a:picLocks noChangeAspect="1" noChangeArrowheads="1"/>
-                    </pic:cNvPicPr>
-                  </pic:nvPicPr>
-                  <pic:blipFill>
-                    <a:blip r:embed="rId11" cstate="print">
-                      <a:extLst>
-                        <a:ext uri="{28A0092B-C50C-407E-A947-70E740481C1C}">
-                          <a14:useLocalDpi xmlns:a14="http://schemas.microsoft.com/office/drawing/2010/main" val="0"/>
-                        </a:ext>
-                      </a:extLst>
-                    </a:blip>
-                    <a:srcRect/>
-                    <a:stretch>
-                      <a:fillRect/>
-                    </a:stretch>
-                  </pic:blipFill>
-                  <pic:spPr bwMode="auto">
-                    <a:xfrm>
-                      <a:off x="0" y="0"/>
-                      <a:ext cx="2047875" cy="2327910"/>
-                    </a:xfrm>
-                    <a:prstGeom prst="rect">
-                      <a:avLst/>
-                    </a:prstGeom>
-                    <a:noFill/>
-                    <a:ln>
-                      <a:noFill/>
-                    </a:ln>
-                  </pic:spPr>
-                </pic:pic>
-              </a:graphicData>
-            </a:graphic>
-          </wp:inline>
-        </w:drawing>
-      </w:r>
-    </w:p>
-    <w:p>
-      <w:pPr>
-        <w:pStyle w:val="Heading1"/>
-        <w:numPr>
-          <w:ilvl w:val="0"/>
-          <w:numId w:val="4"/>
-        </w:numPr>
-      </w:pPr>
-      <w:bookmarkStart w:id="2" w:name="_Toc194587194"/>
-      <w:r>
-        <w:t>ĐỐI VỚI NHÂN VIÊN QUẢN LÝ THẺ</w:t>
-      </w:r>
-      <w:bookmarkEnd w:id="2"/>
-    </w:p>
-    <w:p>
-      <w:pPr>
-        <w:pStyle w:val="Heading2"/>
-        <w:ind w:left="360"/>
-      </w:pPr>
-      <w:bookmarkStart w:id="3" w:name="_Toc194587195"/>
-      <w:r>
-        <w:rPr>
-          <w:rFonts w:asciiTheme="minorHAnsi" w:eastAsiaTheme="minorEastAsia" w:hAnsiTheme="minorHAnsi" w:cstheme="minorBidi"/>
-          <w:caps w:val="0"/>
-          <w:spacing w:val="0"/>
-        </w:rPr>
-        <w:t xml:space="preserve">I. </w:t>
-      </w:r>
-      <w:r>
-        <w:t>SETUP &amp; CONFIG</w:t>
-      </w:r>
-      <w:bookmarkEnd w:id="3"/>
-      <w:r>
-        <w:t xml:space="preserve"> </w:t>
-      </w:r>
-    </w:p>
-    <w:p>
-      <w:pPr>
-        <w:pStyle w:val="Heading3"/>
-        <w:ind w:left="360"/>
-      </w:pPr>
-      <w:bookmarkStart w:id="4" w:name="_Toc194587196"/>
-      <w:r>
-        <w:t>1</w:t>
-      </w:r>
-      <w:r>
-        <w:t xml:space="preserve">. </w:t>
-      </w:r>
-      <w:r>
-        <w:t>SETUP</w:t>
-      </w:r>
-      <w:bookmarkEnd w:id="4"/>
-    </w:p>
-    <w:p>
-      <w:pPr>
-        <w:ind w:firstLine="360"/>
-      </w:pPr>
-      <w:r>
-        <w:t xml:space="preserve">Vào địa chỉ </w:t>
-      </w:r>
-      <w:hyperlink r:id="rId12" w:history="1">
-        <w:r>
-          <w:rPr>
-            <w:rStyle w:val="Hyperlink"/>
-          </w:rPr>
-          <w:t>\\192.168.0.247\the_it\ThangMay</w:t>
-        </w:r>
-      </w:hyperlink>
-      <w:r>
-        <w:t xml:space="preserve"> lấy 2 thư mục Server và Client về máy cần cài đặt</w:t>
-      </w:r>
-    </w:p>
-    <w:p>
-      <w:pPr>
-        <w:ind w:firstLine="360"/>
-      </w:pPr>
-      <w:r>
-        <w:t>Cài Server trước,  Client sau</w:t>
-      </w:r>
-    </w:p>
-    <w:p>
-      <w:pPr>
-        <w:pStyle w:val="Heading3"/>
-        <w:ind w:left="360"/>
-      </w:pPr>
-      <w:bookmarkStart w:id="5" w:name="_Toc194587197"/>
-      <w:r>
-        <w:t>2</w:t>
-      </w:r>
-      <w:r>
-        <w:rPr>
-          <w:lang w:val="vi-VN"/>
-        </w:rPr>
-        <w:t xml:space="preserve">. </w:t>
-      </w:r>
-      <w:r>
-        <w:t>CONFIG</w:t>
-      </w:r>
-      <w:bookmarkEnd w:id="5"/>
-      <w:r>
-        <w:t xml:space="preserve"> </w:t>
-      </w:r>
-    </w:p>
-    <w:p>
-      <w:pPr>
-        <w:pStyle w:val="Heading4"/>
-        <w:ind w:left="360"/>
-        <w:rPr>
-          <w:rStyle w:val="Heading3Char"/>
-        </w:rPr>
-      </w:pPr>
-      <w:r>
-        <w:t xml:space="preserve">2.1 </w:t>
-      </w:r>
-      <w:r>
-        <w:rPr>
-          <w:rStyle w:val="Heading3Char"/>
-        </w:rPr>
-        <w:t>Config Server : Login vào 701 Server(một thời điểm chỉ một máy tính được chạy)</w:t>
-      </w:r>
-    </w:p>
-    <w:p>
-      <w:pPr>
-        <w:ind w:left="360"/>
-      </w:pPr>
-      <w:r>
-        <w:rPr>
-          <w:noProof/>
-        </w:rPr>
-        <w:drawing>
-          <wp:inline distT="0" distB="0" distL="0" distR="0" wp14:anchorId="450D54F2" wp14:editId="69BB61DD">
-            <wp:extent cx="5943600" cy="2853055"/>
-            <wp:effectExtent l="0" t="0" r="0" b="4445"/>
+          <wp:inline distT="0" distB="0" distL="0" distR="0" wp14:anchorId="41F49161" wp14:editId="1DEC5A2B">
+            <wp:extent cx="5943600" cy="4457700"/>
+            <wp:effectExtent l="0" t="0" r="0" b="0"/>
             <wp:docPr id="2" name="Picture 2"/>
             <wp:cNvGraphicFramePr>
               <a:graphicFrameLocks xmlns:a="http://schemas.openxmlformats.org/drawingml/2006/main" noChangeAspect="1"/>
@@ -1575,7 +1485,7 @@
                     <pic:cNvPicPr/>
                   </pic:nvPicPr>
                   <pic:blipFill>
-                    <a:blip r:embed="rId13"/>
+                    <a:blip r:embed="rId10"/>
                     <a:stretch>
                       <a:fillRect/>
                     </a:stretch>
@@ -1583,7 +1493,7 @@
                   <pic:spPr>
                     <a:xfrm>
                       <a:off x="0" y="0"/>
-                      <a:ext cx="5943600" cy="2853055"/>
+                      <a:ext cx="5943600" cy="4457700"/>
                     </a:xfrm>
                     <a:prstGeom prst="rect">
                       <a:avLst/>
@@ -1598,25 +1508,114 @@
     </w:p>
     <w:p>
       <w:pPr>
-        <w:ind w:firstLine="360"/>
+        <w:pStyle w:val="ListParagraph"/>
+        <w:ind w:left="1080"/>
+      </w:pPr>
+    </w:p>
+    <w:p>
+      <w:pPr>
+        <w:pStyle w:val="ListParagraph"/>
+        <w:numPr>
+          <w:ilvl w:val="0"/>
+          <w:numId w:val="8"/>
+        </w:numPr>
+      </w:pPr>
+      <w:r>
+        <w:t>Các điều kiện mặc định</w:t>
+      </w:r>
+    </w:p>
+    <w:p>
+      <w:pPr>
+        <w:pStyle w:val="ListParagraph"/>
+        <w:numPr>
+          <w:ilvl w:val="1"/>
+          <w:numId w:val="8"/>
+        </w:numPr>
+      </w:pPr>
+      <w:r>
+        <w:t>Store Group gắn chặt(không được chọn lại) với user login, riêng ADMIN, Purchaser và CFO thì được ô đó được gán All và được quyền lựa chọn</w:t>
+      </w:r>
+    </w:p>
+    <w:p>
+      <w:pPr>
+        <w:pStyle w:val="ListParagraph"/>
+        <w:numPr>
+          <w:ilvl w:val="1"/>
+          <w:numId w:val="8"/>
+        </w:numPr>
+      </w:pPr>
+      <w:r>
+        <w:t>From Date , Todate được Default nhưu sau: ToDate= ngày hiện tại, From Date = ngày cách ngày hiện tại 3 tháng trước</w:t>
+      </w:r>
+    </w:p>
+    <w:p>
+      <w:pPr>
+        <w:pStyle w:val="ListParagraph"/>
+        <w:numPr>
+          <w:ilvl w:val="1"/>
+          <w:numId w:val="8"/>
+        </w:numPr>
+      </w:pPr>
+      <w:r>
+        <w:t xml:space="preserve">Status là một multiselect và được gán lùi một giá trị so với giá trị  </w:t>
+      </w:r>
+      <w:r>
+        <w:t>Approval</w:t>
+      </w:r>
+      <w:r>
+        <w:t xml:space="preserve"> trong </w:t>
+      </w:r>
+      <w:r>
+        <w:t>MS_Employee</w:t>
+      </w:r>
+      <w:r>
+        <w:t xml:space="preserve"> của user login </w:t>
+      </w:r>
+      <w:r>
+        <w:t>mục đích là để thấy những Material quest chờ người đó xử lý</w:t>
+      </w:r>
+    </w:p>
+    <w:p>
+      <w:pPr>
+        <w:pStyle w:val="ListParagraph"/>
+        <w:numPr>
+          <w:ilvl w:val="0"/>
+          <w:numId w:val="8"/>
+        </w:numPr>
+      </w:pPr>
+      <w:r>
+        <w:t>Tạo mới Material quest</w:t>
+      </w:r>
+    </w:p>
+    <w:p>
+      <w:pPr>
+        <w:pStyle w:val="ListParagraph"/>
+        <w:numPr>
+          <w:ilvl w:val="1"/>
+          <w:numId w:val="8"/>
+        </w:numPr>
       </w:pPr>
       <w:r>
         <w:lastRenderedPageBreak/>
-        <w:t>Click vào “COM” -&gt; TCP/IP Only/Yes</w:t>
-      </w:r>
-    </w:p>
-    <w:p>
-      <w:pPr>
-        <w:ind w:left="360"/>
+        <w:t xml:space="preserve">Tạo mới một MR  </w:t>
+      </w:r>
+      <w:r>
+        <w:t xml:space="preserve">thông thường: Nhấn vào nút Create MR, một cửa sổ heiejn ra như sau: </w:t>
+      </w:r>
+    </w:p>
+    <w:p>
+      <w:pPr>
+        <w:pStyle w:val="ListParagraph"/>
+        <w:ind w:left="1800"/>
       </w:pPr>
       <w:r>
         <w:rPr>
           <w:noProof/>
         </w:rPr>
         <w:drawing>
-          <wp:inline distT="0" distB="0" distL="0" distR="0" wp14:anchorId="3F8F68DB" wp14:editId="575FB65C">
-            <wp:extent cx="5943600" cy="2865755"/>
-            <wp:effectExtent l="0" t="0" r="0" b="0"/>
+          <wp:inline distT="0" distB="0" distL="0" distR="0" wp14:anchorId="670C13B8" wp14:editId="25C04D66">
+            <wp:extent cx="4824374" cy="3751775"/>
+            <wp:effectExtent l="0" t="0" r="0" b="1270"/>
             <wp:docPr id="3" name="Picture 3"/>
             <wp:cNvGraphicFramePr>
               <a:graphicFrameLocks xmlns:a="http://schemas.openxmlformats.org/drawingml/2006/main" noChangeAspect="1"/>
@@ -1629,7 +1628,7 @@
                     <pic:cNvPicPr/>
                   </pic:nvPicPr>
                   <pic:blipFill>
-                    <a:blip r:embed="rId14"/>
+                    <a:blip r:embed="rId11"/>
                     <a:stretch>
                       <a:fillRect/>
                     </a:stretch>
@@ -1637,7 +1636,7 @@
                   <pic:spPr>
                     <a:xfrm>
                       <a:off x="0" y="0"/>
-                      <a:ext cx="5943600" cy="2865755"/>
+                      <a:ext cx="4827800" cy="3754439"/>
                     </a:xfrm>
                     <a:prstGeom prst="rect">
                       <a:avLst/>
@@ -1649,108 +1648,8 @@
           </wp:inline>
         </w:drawing>
       </w:r>
-    </w:p>
-    <w:p>
-      <w:pPr>
-        <w:ind w:left="360"/>
-      </w:pPr>
-      <w:r>
-        <w:t xml:space="preserve">Click “LAN” -&gt; </w:t>
-      </w:r>
-      <w:r>
-        <w:t>chọn thông số như khung hình màu đỏ rồi nhấn “YES”</w:t>
-      </w:r>
-    </w:p>
-    <w:p>
-      <w:pPr>
-        <w:pStyle w:val="Heading2"/>
-        <w:ind w:left="360"/>
-      </w:pPr>
-      <w:bookmarkStart w:id="6" w:name="_Toc194587198"/>
-      <w:r>
-        <w:t>II</w:t>
-      </w:r>
-      <w:r>
-        <w:t>.</w:t>
-      </w:r>
-      <w:r>
-        <w:t>QUẢN LÝ THẺ</w:t>
-      </w:r>
-      <w:bookmarkEnd w:id="6"/>
-    </w:p>
-    <w:p>
-      <w:pPr>
-        <w:pStyle w:val="Heading3"/>
-        <w:ind w:left="360"/>
-      </w:pPr>
-      <w:bookmarkStart w:id="7" w:name="_Toc194587199"/>
-      <w:r>
-        <w:t>1.THÊM MỘT THẺ MỚI VÀO HỆ THỐNG</w:t>
-      </w:r>
-      <w:bookmarkEnd w:id="7"/>
-    </w:p>
-    <w:p>
-      <w:pPr>
-        <w:ind w:left="360"/>
-      </w:pPr>
-      <w:r>
-        <w:t xml:space="preserve">Từ màn hình chính của Client, </w:t>
-      </w:r>
-      <w:r>
-        <w:t>Nhấ</w:t>
-      </w:r>
-      <w:r>
-        <w:t xml:space="preserve">n vào nút số 8 </w:t>
-      </w:r>
-      <w:r>
-        <w:t>sẽ có một màn hình xuát hiện như sau:</w:t>
-      </w:r>
-    </w:p>
-    <w:p/>
-    <w:p>
-      <w:pPr>
-        <w:ind w:left="360"/>
-      </w:pPr>
-      <w:r>
-        <w:rPr>
-          <w:noProof/>
-        </w:rPr>
-        <w:lastRenderedPageBreak/>
-        <w:drawing>
-          <wp:inline distT="0" distB="0" distL="0" distR="0" wp14:anchorId="6D2F9FD5" wp14:editId="29828EA0">
-            <wp:extent cx="5943600" cy="4498340"/>
-            <wp:effectExtent l="0" t="0" r="0" b="0"/>
-            <wp:docPr id="6" name="Picture 6"/>
-            <wp:cNvGraphicFramePr>
-              <a:graphicFrameLocks xmlns:a="http://schemas.openxmlformats.org/drawingml/2006/main" noChangeAspect="1"/>
-            </wp:cNvGraphicFramePr>
-            <a:graphic xmlns:a="http://schemas.openxmlformats.org/drawingml/2006/main">
-              <a:graphicData uri="http://schemas.openxmlformats.org/drawingml/2006/picture">
-                <pic:pic xmlns:pic="http://schemas.openxmlformats.org/drawingml/2006/picture">
-                  <pic:nvPicPr>
-                    <pic:cNvPr id="1" name=""/>
-                    <pic:cNvPicPr/>
-                  </pic:nvPicPr>
-                  <pic:blipFill>
-                    <a:blip r:embed="rId15"/>
-                    <a:stretch>
-                      <a:fillRect/>
-                    </a:stretch>
-                  </pic:blipFill>
-                  <pic:spPr>
-                    <a:xfrm>
-                      <a:off x="0" y="0"/>
-                      <a:ext cx="5943600" cy="4498340"/>
-                    </a:xfrm>
-                    <a:prstGeom prst="rect">
-                      <a:avLst/>
-                    </a:prstGeom>
-                  </pic:spPr>
-                </pic:pic>
-              </a:graphicData>
-            </a:graphic>
-          </wp:inline>
-        </w:drawing>
+      <w:r>
+        <w:t xml:space="preserve"> </w:t>
       </w:r>
     </w:p>
     <w:p>
@@ -1758,50 +1657,11 @@
         <w:pStyle w:val="ListParagraph"/>
         <w:numPr>
           <w:ilvl w:val="1"/>
-          <w:numId w:val="2"/>
+          <w:numId w:val="8"/>
         </w:numPr>
-        <w:ind w:left="720"/>
-      </w:pPr>
-      <w:r>
-        <w:rPr>
-          <w:b/>
-        </w:rPr>
-        <w:t>Step 1</w:t>
-      </w:r>
-      <w:r>
-        <w:t xml:space="preserve">:  </w:t>
-      </w:r>
-      <w:r>
-        <w:t xml:space="preserve">Xác định số </w:t>
-      </w:r>
-      <w:r>
-        <w:t xml:space="preserve">User Num </w:t>
-      </w:r>
-      <w:r>
-        <w:t xml:space="preserve">cuối cùng của vùng cần </w:t>
-      </w:r>
-    </w:p>
-    <w:p>
-      <w:pPr>
-        <w:pStyle w:val="ListParagraph"/>
-      </w:pPr>
-      <w:r>
-        <w:t>V</w:t>
-      </w:r>
-      <w:r>
-        <w:t>í dụ nếu thêm thẻ nhân viên thì vùng số cho thẻ nhân viên được quy định từ 2001 đến 2500</w:t>
-      </w:r>
-      <w:r>
-        <w:t>, nhìn vào ô số 1 thấy con số 00108 điều này có nghĩa là đã có 108 thẻ được quản lý trên máy tính này.</w:t>
-      </w:r>
-      <w:r>
-        <w:t xml:space="preserve"> Lấy 2001 +108 = 2109</w:t>
-      </w:r>
-      <w:r>
-        <w:t>. Gõ 2109 vào ô User Num, nhấn emter nếu thấy các ô card id, alias có thông tin thì dùng chuột nhấp vào nút đi lên của ô User num để tìm ra số thứ tự còn trống gần nhất</w:t>
-      </w:r>
-      <w:r>
-        <w:t>. Qua bước 2</w:t>
+      </w:pPr>
+      <w:r>
+        <w:t>Điền mã hoặc tiên, hoặc cả 2, nếu cần xem số lượng tồn kho hiện có của hàng đó thì check vào nút Check Balance in Store</w:t>
       </w:r>
     </w:p>
     <w:p>
@@ -1809,126 +1669,31 @@
         <w:pStyle w:val="ListParagraph"/>
         <w:numPr>
           <w:ilvl w:val="1"/>
-          <w:numId w:val="2"/>
+          <w:numId w:val="8"/>
         </w:numPr>
-        <w:ind w:left="720"/>
-      </w:pPr>
-      <w:r>
-        <w:rPr>
-          <w:b/>
-        </w:rPr>
-        <w:t>Step 2</w:t>
-      </w:r>
-      <w:r>
-        <w:t>: Cập nhật thông tin vào thẻ trống</w:t>
-      </w:r>
-    </w:p>
-    <w:p>
-      <w:pPr>
-        <w:pStyle w:val="ListParagraph"/>
-      </w:pPr>
-      <w:r>
-        <w:t>Đ</w:t>
-      </w:r>
-      <w:r>
-        <w:t>ưa con chuột vào ô số 3 xóa số 0 nếu có trong ô này, quẹt thẻ-&gt; số thẻ do đầu đọc sẽ tự động điền vào ô số 3, chọn Card Only vào ô thứ 4</w:t>
-      </w:r>
-      <w:r>
-        <w:t>, điền name hoặc Alias vào ô 5,6</w:t>
-      </w:r>
-      <w:r>
-        <w:t>=&gt; nhấn Save</w:t>
-      </w:r>
-      <w:r>
-        <w:t>. Qua bước 3</w:t>
+      </w:pPr>
+      <w:r>
+        <w:t>Nhấn Search, nhấn “&gt;” để chuyển qua bên phải, lặp lại với item khác( riêng với item /Service mới thì sẽ được mô tả sau), điền mô tả mục đích sử dụng vào Description, rồi nhấn Create MR. Cửa số  Material Request Detail hiện ra như sau:</w:t>
       </w:r>
     </w:p>
     <w:p>
       <w:pPr>
         <w:pStyle w:val="ListParagraph"/>
         <w:numPr>
-          <w:ilvl w:val="1"/>
-          <w:numId w:val="2"/>
+          <w:ilvl w:val="0"/>
+          <w:numId w:val="8"/>
         </w:numPr>
-        <w:ind w:left="720"/>
-      </w:pPr>
-      <w:r>
-        <w:rPr>
-          <w:b/>
-        </w:rPr>
-        <w:t>Bước 3</w:t>
-      </w:r>
-      <w:r>
-        <w:t xml:space="preserve">: </w:t>
-      </w:r>
-      <w:r>
-        <w:t>Chuyển thông tin thẻ này lên Controller</w:t>
-      </w:r>
+      </w:pPr>
+      <w:r>
+        <w:t>Tính toán, phê duyệt thì dùng các nút Caculate(chỉ Purchaser được dùng khi nó ở trạng thái 0)</w:t>
+      </w:r>
+      <w:bookmarkStart w:id="0" w:name="_GoBack"/>
+      <w:bookmarkEnd w:id="0"/>
     </w:p>
     <w:p>
       <w:pPr>
         <w:pStyle w:val="ListParagraph"/>
-      </w:pPr>
-      <w:r>
-        <w:t>Nhấn vào button có mũi tên xuống ngay phía dưới ô  số 1</w:t>
-      </w:r>
-      <w:r>
-        <w:t>. Hệ thống sẽ chuyển thông tin thẻ này lên cả 4 controller</w:t>
-      </w:r>
-      <w:r>
-        <w:t>(Tại sao nhấn 1 cái lên cả 4 controller là do ncc đã cấu hình sẵn</w:t>
-      </w:r>
-      <w:r>
-        <w:t xml:space="preserve"> như vậy</w:t>
-      </w:r>
-      <w:r>
-        <w:t>)</w:t>
-      </w:r>
-      <w:r>
-        <w:t xml:space="preserve"> </w:t>
-      </w:r>
-    </w:p>
-    <w:p>
-      <w:pPr>
-        <w:pStyle w:val="ListParagraph"/>
-        <w:numPr>
-          <w:ilvl w:val="1"/>
-          <w:numId w:val="2"/>
-        </w:numPr>
-        <w:ind w:left="720"/>
-      </w:pPr>
-      <w:r>
-        <w:rPr>
-          <w:b/>
-        </w:rPr>
-        <w:t>Bước 4</w:t>
-      </w:r>
-      <w:r>
-        <w:t xml:space="preserve">: Phân quyền đi các tầng </w:t>
-      </w:r>
-      <w:r>
-        <w:t xml:space="preserve">và thang </w:t>
-      </w:r>
-      <w:r>
-        <w:t>cho một thẻ</w:t>
-      </w:r>
-    </w:p>
-    <w:p>
-      <w:pPr>
-        <w:pStyle w:val="ListParagraph"/>
-      </w:pPr>
-    </w:p>
-    <w:p>
-      <w:pPr>
-        <w:pStyle w:val="ListParagraph"/>
-      </w:pPr>
-      <w:r>
-        <w:t>Click chuột vào hình búa một cửa sổ xuất hiện như sau</w:t>
-      </w:r>
-    </w:p>
-    <w:p>
-      <w:pPr>
-        <w:pStyle w:val="ListParagraph"/>
+        <w:ind w:left="1800"/>
       </w:pPr>
       <w:r>
         <w:rPr>
@@ -1936,9 +1701,9 @@
         </w:rPr>
         <w:lastRenderedPageBreak/>
         <w:drawing>
-          <wp:inline distT="0" distB="0" distL="0" distR="0" wp14:anchorId="7698920C" wp14:editId="5627D01E">
-            <wp:extent cx="3848334" cy="3419507"/>
-            <wp:effectExtent l="0" t="0" r="0" b="0"/>
+          <wp:inline distT="0" distB="0" distL="0" distR="0" wp14:anchorId="665E02C4" wp14:editId="3B3970C0">
+            <wp:extent cx="5043830" cy="3669710"/>
+            <wp:effectExtent l="0" t="0" r="4445" b="6985"/>
             <wp:docPr id="5" name="Picture 5"/>
             <wp:cNvGraphicFramePr>
               <a:graphicFrameLocks xmlns:a="http://schemas.openxmlformats.org/drawingml/2006/main" noChangeAspect="1"/>
@@ -1951,7 +1716,7 @@
                     <pic:cNvPicPr/>
                   </pic:nvPicPr>
                   <pic:blipFill>
-                    <a:blip r:embed="rId16"/>
+                    <a:blip r:embed="rId12"/>
                     <a:stretch>
                       <a:fillRect/>
                     </a:stretch>
@@ -1959,7 +1724,7 @@
                   <pic:spPr>
                     <a:xfrm>
                       <a:off x="0" y="0"/>
-                      <a:ext cx="3856803" cy="3427032"/>
+                      <a:ext cx="5050770" cy="3674759"/>
                     </a:xfrm>
                     <a:prstGeom prst="rect">
                       <a:avLst/>
@@ -1974,51 +1739,20 @@
     </w:p>
     <w:p>
       <w:pPr>
-        <w:ind w:left="720"/>
-      </w:pPr>
-      <w:r>
-        <w:t xml:space="preserve">Click vào ô User cho nó mở ra, click lần nữa cho nó đóng lại, gõ số user num mà bạn </w:t>
+        <w:pStyle w:val="ListParagraph"/>
+        <w:ind w:left="1800"/>
+      </w:pPr>
+      <w:r>
+        <w:t xml:space="preserve">Nếu cần một item/Service mới chưa tồn tại trên hệ thống thì nhấn vào nút Create New Item, sẽ xuất hiện một ô để điền tên, đơn vị tính, mã (tự động phát sinh dựa vào thời gian), nhấn OK thì item mới đó sẽ nhảy vào lưới của page </w:t>
+      </w:r>
+      <w:r>
+        <w:t>Material Request Detail</w:t>
       </w:r>
       <w:r>
         <w:br/>
       </w:r>
       <w:r>
-        <w:t>muốn phân quyền cho thẻ này</w:t>
-      </w:r>
-      <w:r>
-        <w:t>, lưu ý số này sẽ là 5 chữ số, nên có thể bạn sẽ phải gõ số</w:t>
-      </w:r>
-      <w:r>
         <w:br/>
-      </w:r>
-      <w:r>
-        <w:t>0 đầu tiên</w:t>
-      </w:r>
-      <w:r>
-        <w:t>.</w:t>
-      </w:r>
-    </w:p>
-    <w:p>
-      <w:pPr>
-        <w:ind w:left="720"/>
-      </w:pPr>
-      <w:r>
-        <w:t xml:space="preserve">Click vào Read One hệ thống sẽ show lên quyền đi những thang nào </w:t>
-      </w:r>
-      <w:r>
-        <w:t>,m</w:t>
-      </w:r>
-      <w:r>
-        <w:t xml:space="preserve">uốn cập nhật quyền đi các </w:t>
-      </w:r>
-      <w:r>
-        <w:br/>
-      </w:r>
-      <w:r>
-        <w:t>tầng của thẻ này ở mỗi thang thì sẽ chọn từng thang một rồi chọn những tầng được đi. Nhấn Write One</w:t>
-      </w:r>
-      <w:r>
-        <w:t>. Lặp lại việc này bằng cách chọn thang khác  rồi lại chọn các tầng tương ứng, bấm Write One.</w:t>
       </w:r>
     </w:p>
     <w:p>
@@ -2026,364 +1760,92 @@
         <w:pStyle w:val="ListParagraph"/>
         <w:numPr>
           <w:ilvl w:val="0"/>
-          <w:numId w:val="3"/>
+          <w:numId w:val="12"/>
         </w:numPr>
-        <w:ind w:left="1080"/>
-      </w:pPr>
-      <w:r>
-        <w:t>Lưu ý thang 04 là thang nhân viên thì lầu 16 tương ứng với B1</w:t>
-      </w:r>
-    </w:p>
-    <w:p/>
-    <w:p>
-      <w:pPr>
-        <w:pStyle w:val="Heading3"/>
-        <w:ind w:left="360"/>
-      </w:pPr>
-      <w:bookmarkStart w:id="8" w:name="_Toc194587200"/>
-      <w:r>
-        <w:t>2.</w:t>
-      </w:r>
-      <w:r>
-        <w:t>THÊM</w:t>
-      </w:r>
-      <w:r>
-        <w:t xml:space="preserve"> </w:t>
-      </w:r>
-      <w:r>
-        <w:t>HÀNG LOẠT THẺ</w:t>
-      </w:r>
-      <w:r>
-        <w:t xml:space="preserve"> </w:t>
-      </w:r>
-      <w:r>
-        <w:t>MỚI</w:t>
-      </w:r>
-      <w:r>
-        <w:t xml:space="preserve"> </w:t>
-      </w:r>
-      <w:r>
-        <w:t>VÀO HỆ THỐNG</w:t>
-      </w:r>
-      <w:bookmarkEnd w:id="8"/>
+      </w:pPr>
+      <w:r>
+        <w:t>PURCHASING REQUISITION</w:t>
+      </w:r>
     </w:p>
     <w:p>
       <w:pPr>
         <w:pStyle w:val="ListParagraph"/>
         <w:numPr>
-          <w:ilvl w:val="1"/>
-          <w:numId w:val="2"/>
+          <w:ilvl w:val="0"/>
+          <w:numId w:val="12"/>
         </w:numPr>
-        <w:ind w:left="720"/>
-      </w:pPr>
-      <w:r>
-        <w:rPr>
-          <w:b/>
-        </w:rPr>
-        <w:t>Step 1</w:t>
-      </w:r>
-      <w:r>
-        <w:t xml:space="preserve">:  Xác định số User Num cuối cùng của vùng cần </w:t>
-      </w:r>
-    </w:p>
-    <w:p>
-      <w:pPr>
-        <w:pStyle w:val="ListParagraph"/>
-      </w:pPr>
-      <w:r>
-        <w:t xml:space="preserve">Giống hệt </w:t>
-      </w:r>
-      <w:r>
-        <w:t>bước 1 khi thêm một thẻ mới</w:t>
-      </w:r>
-      <w:r>
-        <w:t>.</w:t>
-      </w:r>
-      <w:r>
-        <w:t xml:space="preserve"> </w:t>
+      </w:pPr>
+      <w:r>
+        <w:t>PURCHASE ORDER</w:t>
       </w:r>
     </w:p>
     <w:p>
       <w:pPr>
         <w:pStyle w:val="ListParagraph"/>
         <w:numPr>
-          <w:ilvl w:val="1"/>
-          <w:numId w:val="2"/>
+          <w:ilvl w:val="0"/>
+          <w:numId w:val="12"/>
         </w:numPr>
-        <w:ind w:left="720"/>
-      </w:pPr>
-      <w:r>
-        <w:rPr>
-          <w:b/>
-        </w:rPr>
-        <w:t>Step 2</w:t>
-      </w:r>
-      <w:r>
-        <w:t>: Cập nhật thông tin vào thẻ trống</w:t>
-      </w:r>
-      <w:r>
-        <w:br/>
-      </w:r>
-      <w:r>
-        <w:t xml:space="preserve">Giống hệt </w:t>
-      </w:r>
-      <w:r>
-        <w:t>bước 1 khi thêm một thẻ mới, lặp lại với các thẻ kế tiếp.</w:t>
+      </w:pPr>
+      <w:r>
+        <w:t>SUPPERLIER- PO REPORT</w:t>
       </w:r>
     </w:p>
     <w:p>
       <w:pPr>
         <w:pStyle w:val="ListParagraph"/>
         <w:numPr>
-          <w:ilvl w:val="1"/>
-          <w:numId w:val="2"/>
+          <w:ilvl w:val="0"/>
+          <w:numId w:val="12"/>
         </w:numPr>
-        <w:ind w:left="720"/>
-      </w:pPr>
-      <w:r>
-        <w:rPr>
-          <w:b/>
-        </w:rPr>
-        <w:t>Step 3</w:t>
-      </w:r>
-      <w:r>
-        <w:t>: Chuyển hàng loạt thẻ xuống từng controller</w:t>
-      </w:r>
-      <w:r>
-        <w:br/>
-      </w:r>
-      <w:r>
-        <w:t>Nhấn vào nút số 2(cái búa)/Read Write to Cxx như hình sau:</w:t>
-      </w:r>
-    </w:p>
-    <w:p>
-      <w:pPr>
-        <w:ind w:left="360"/>
-      </w:pPr>
-      <w:r>
-        <w:rPr>
-          <w:noProof/>
-        </w:rPr>
-        <w:lastRenderedPageBreak/>
-        <w:drawing>
-          <wp:inline distT="0" distB="0" distL="0" distR="0" wp14:anchorId="0849C5D1" wp14:editId="1136A7F0">
-            <wp:extent cx="3461257" cy="3929638"/>
-            <wp:effectExtent l="0" t="0" r="6350" b="0"/>
-            <wp:docPr id="10" name="Picture 10"/>
-            <wp:cNvGraphicFramePr>
-              <a:graphicFrameLocks xmlns:a="http://schemas.openxmlformats.org/drawingml/2006/main" noChangeAspect="1"/>
-            </wp:cNvGraphicFramePr>
-            <a:graphic xmlns:a="http://schemas.openxmlformats.org/drawingml/2006/main">
-              <a:graphicData uri="http://schemas.openxmlformats.org/drawingml/2006/picture">
-                <pic:pic xmlns:pic="http://schemas.openxmlformats.org/drawingml/2006/picture">
-                  <pic:nvPicPr>
-                    <pic:cNvPr id="1" name=""/>
-                    <pic:cNvPicPr/>
-                  </pic:nvPicPr>
-                  <pic:blipFill>
-                    <a:blip r:embed="rId17"/>
-                    <a:stretch>
-                      <a:fillRect/>
-                    </a:stretch>
-                  </pic:blipFill>
-                  <pic:spPr>
-                    <a:xfrm>
-                      <a:off x="0" y="0"/>
-                      <a:ext cx="3468500" cy="3937861"/>
-                    </a:xfrm>
-                    <a:prstGeom prst="rect">
-                      <a:avLst/>
-                    </a:prstGeom>
-                  </pic:spPr>
-                </pic:pic>
-              </a:graphicData>
-            </a:graphic>
-          </wp:inline>
-        </w:drawing>
-      </w:r>
-    </w:p>
-    <w:p>
-      <w:pPr>
-        <w:ind w:left="360"/>
-      </w:pPr>
-      <w:r>
-        <w:t>Chúng ta sẽ thực hiện các nghiệp vụ theo chiều mũi tên</w:t>
-      </w:r>
-      <w:r>
-        <w:br/>
-      </w:r>
-      <w:r>
-        <w:t>Chọn Controller (1,2,3,4) tương đương với 4 thang máy</w:t>
-      </w:r>
-      <w:r>
-        <w:br/>
-      </w:r>
-      <w:r>
-        <w:t>Chọn Controller, chọn Write, gõ user num from , user num to, check vào option 3xx/7xx/8xxH Serial under P(hiện là dòng dưới cùng)</w:t>
-      </w:r>
-      <w:r>
-        <w:t>, nhấn Start</w:t>
-      </w:r>
-      <w:r>
-        <w:t>. Lặp lại việc này với việc chọn Controller mới để cập nhật lên thang tương ứng</w:t>
-      </w:r>
-    </w:p>
-    <w:p>
-      <w:pPr>
-        <w:pStyle w:val="ListParagraph"/>
+      </w:pPr>
+      <w:r>
+        <w:t>ANALYZING SUPPLIER</w:t>
+      </w:r>
+    </w:p>
+    <w:p>
+      <w:pPr>
+        <w:pStyle w:val="Heading2"/>
         <w:numPr>
-          <w:ilvl w:val="1"/>
-          <w:numId w:val="2"/>
+          <w:ilvl w:val="0"/>
+          <w:numId w:val="11"/>
         </w:numPr>
-        <w:ind w:left="360"/>
-        <w:rPr>
-          <w:b/>
-        </w:rPr>
-      </w:pPr>
-      <w:r>
-        <w:rPr>
-          <w:b/>
-        </w:rPr>
-        <w:t>Step</w:t>
-      </w:r>
-      <w:r>
-        <w:rPr>
-          <w:b/>
-        </w:rPr>
-        <w:t xml:space="preserve"> 4</w:t>
-      </w:r>
-      <w:r>
-        <w:rPr>
-          <w:b/>
-        </w:rPr>
-        <w:t>: Phân quyền đi các tầng và thang cho một thẻ:</w:t>
-      </w:r>
-    </w:p>
-    <w:p>
-      <w:pPr>
-        <w:ind w:firstLine="360"/>
-        <w:rPr>
-          <w:color w:val="FF0000"/>
-        </w:rPr>
-      </w:pPr>
-      <w:r>
-        <w:rPr>
-          <w:color w:val="FF0000"/>
-        </w:rPr>
-        <w:t>Ngày mai NCC hướng dẫn</w:t>
-      </w:r>
-    </w:p>
-    <w:p>
-      <w:pPr>
-        <w:pStyle w:val="Heading3"/>
-      </w:pPr>
-      <w:r>
-        <w:t>3. XÓA HOẶC CẬP NHẬT THÔNG TIN CHO MỘT THẺ</w:t>
-      </w:r>
-    </w:p>
-    <w:p>
-      <w:r>
-        <w:t>Step 1: Tìm thông tin thẻ đó dựa vào Alias</w:t>
-      </w:r>
-      <w:r>
-        <w:t>, name</w:t>
-      </w:r>
-      <w:r>
-        <w:t xml:space="preserve"> hoặc Card ID</w:t>
-      </w:r>
-    </w:p>
-    <w:p>
-      <w:r>
-        <w:t>Từ màn hình chính của Client, nhấn vào nút số 8, màn hình thông tin một thẻ xuất hiện như sau</w:t>
-      </w:r>
-    </w:p>
-    <w:p>
-      <w:r>
-        <w:rPr>
-          <w:noProof/>
-        </w:rPr>
-        <w:lastRenderedPageBreak/>
-        <w:drawing>
-          <wp:inline distT="0" distB="0" distL="0" distR="0" wp14:anchorId="5B26209E" wp14:editId="6D0A85E9">
-            <wp:extent cx="5943600" cy="4467860"/>
-            <wp:effectExtent l="0" t="0" r="0" b="8890"/>
-            <wp:docPr id="1" name="Picture 1"/>
-            <wp:cNvGraphicFramePr>
-              <a:graphicFrameLocks xmlns:a="http://schemas.openxmlformats.org/drawingml/2006/main" noChangeAspect="1"/>
-            </wp:cNvGraphicFramePr>
-            <a:graphic xmlns:a="http://schemas.openxmlformats.org/drawingml/2006/main">
-              <a:graphicData uri="http://schemas.openxmlformats.org/drawingml/2006/picture">
-                <pic:pic xmlns:pic="http://schemas.openxmlformats.org/drawingml/2006/picture">
-                  <pic:nvPicPr>
-                    <pic:cNvPr id="1" name=""/>
-                    <pic:cNvPicPr/>
-                  </pic:nvPicPr>
-                  <pic:blipFill>
-                    <a:blip r:embed="rId18"/>
-                    <a:stretch>
-                      <a:fillRect/>
-                    </a:stretch>
-                  </pic:blipFill>
-                  <pic:spPr>
-                    <a:xfrm>
-                      <a:off x="0" y="0"/>
-                      <a:ext cx="5943600" cy="4467860"/>
-                    </a:xfrm>
-                    <a:prstGeom prst="rect">
-                      <a:avLst/>
-                    </a:prstGeom>
-                  </pic:spPr>
-                </pic:pic>
-              </a:graphicData>
-            </a:graphic>
-          </wp:inline>
-        </w:drawing>
-      </w:r>
-    </w:p>
-    <w:p>
-      <w:r>
-        <w:t>Nếu cần tìm theo alias hoặc name thì click chuột vào ô được đánh khung đỏ như hình trên, nhấn nút kính lúp ngay phía dưới để tìm kiếm.</w:t>
-      </w:r>
-    </w:p>
-    <w:p>
-      <w:r>
-        <w:t>Nếu không có thông tin gì chỉ có mỗi cái thẻ trắng thì cũng đưa con chuột vào ô trên rồi quẹt thẻ</w:t>
-      </w:r>
-      <w:r>
-        <w:t xml:space="preserve"> và</w:t>
-      </w:r>
-      <w:r>
-        <w:t>o đầu đọc,hệ thống sẽ tự động điền card ID vào ô đó, nhấn vào kính lúp để tìm kiếm</w:t>
-      </w:r>
-    </w:p>
-    <w:p>
-      <w:r>
-        <w:t xml:space="preserve">Step2: Cập nhật thông tin cần cập nhật, nhấn save, nhấn mũi tên để chuyển lên </w:t>
-      </w:r>
-      <w:r>
-        <w:t xml:space="preserve">4 </w:t>
-      </w:r>
-      <w:r>
-        <w:t>controller</w:t>
-      </w:r>
-    </w:p>
-    <w:p>
-      <w:r>
-        <w:t>Step 3: Nhấn vào hình búa/User Acces Floor Edit</w:t>
-      </w:r>
-    </w:p>
-    <w:p>
-      <w:r>
-        <w:t xml:space="preserve">Step 4: Cập nhật quyền đi các tầng của mỗi thang giống hết bước 4 ở mục II.1 </w:t>
+      </w:pPr>
+      <w:r>
+        <w:t>PHONE&amp; NET CONTROL</w:t>
+      </w:r>
+    </w:p>
+    <w:p>
+      <w:pPr>
+        <w:pStyle w:val="Heading2"/>
+        <w:numPr>
+          <w:ilvl w:val="0"/>
+          <w:numId w:val="11"/>
+        </w:numPr>
+      </w:pPr>
+      <w:r>
+        <w:t>ACCOUTING</w:t>
+      </w:r>
+    </w:p>
+    <w:p>
+      <w:pPr>
+        <w:pStyle w:val="Heading2"/>
+        <w:numPr>
+          <w:ilvl w:val="0"/>
+          <w:numId w:val="11"/>
+        </w:numPr>
+      </w:pPr>
+      <w:r>
+        <w:t>ADMIN</w:t>
       </w:r>
     </w:p>
     <w:sectPr>
-      <w:headerReference w:type="even" r:id="rId19"/>
-      <w:headerReference w:type="default" r:id="rId20"/>
-      <w:footerReference w:type="even" r:id="rId21"/>
-      <w:footerReference w:type="default" r:id="rId22"/>
-      <w:headerReference w:type="first" r:id="rId23"/>
-      <w:footerReference w:type="first" r:id="rId24"/>
+      <w:headerReference w:type="even" r:id="rId13"/>
+      <w:headerReference w:type="default" r:id="rId14"/>
+      <w:footerReference w:type="even" r:id="rId15"/>
+      <w:footerReference w:type="default" r:id="rId16"/>
+      <w:headerReference w:type="first" r:id="rId17"/>
+      <w:footerReference w:type="first" r:id="rId18"/>
       <w:pgSz w:w="12240" w:h="15840"/>
       <w:pgMar w:top="1440" w:right="1440" w:bottom="1440" w:left="1440" w:header="720" w:footer="720" w:gutter="0"/>
       <w:cols w:space="720"/>
@@ -2460,7 +1922,7 @@
           <w:rPr>
             <w:noProof/>
           </w:rPr>
-          <w:t>1</w:t>
+          <w:t>5</w:t>
         </w:r>
         <w:r>
           <w:rPr>
@@ -2919,7 +2381,7 @@
         <w:rFonts w:ascii="Courier New" w:hAnsi="Courier New" w:cs="Courier New" w:hint="default"/>
       </w:rPr>
     </w:lvl>
-    <w:lvl w:ilvl="2" w:tplc="04090005" w:tentative="1">
+    <w:lvl w:ilvl="2" w:tplc="04090005">
       <w:start w:val="1"/>
       <w:numFmt w:val="bullet"/>
       <w:lvlText w:val=""/>
@@ -3118,6 +2580,184 @@
     </w:lvl>
   </w:abstractNum>
   <w:abstractNum w:abstractNumId="4" w15:restartNumberingAfterBreak="0">
+    <w:nsid w:val="2C061DBB"/>
+    <w:multiLevelType w:val="hybridMultilevel"/>
+    <w:tmpl w:val="E318A572"/>
+    <w:lvl w:ilvl="0" w:tplc="763661EA">
+      <w:start w:val="1"/>
+      <w:numFmt w:val="upperRoman"/>
+      <w:lvlText w:val="%1."/>
+      <w:lvlJc w:val="left"/>
+      <w:pPr>
+        <w:ind w:left="1080" w:hanging="720"/>
+      </w:pPr>
+      <w:rPr>
+        <w:rFonts w:hint="default"/>
+      </w:rPr>
+    </w:lvl>
+    <w:lvl w:ilvl="1" w:tplc="04090019" w:tentative="1">
+      <w:start w:val="1"/>
+      <w:numFmt w:val="lowerLetter"/>
+      <w:lvlText w:val="%2."/>
+      <w:lvlJc w:val="left"/>
+      <w:pPr>
+        <w:ind w:left="1440" w:hanging="360"/>
+      </w:pPr>
+    </w:lvl>
+    <w:lvl w:ilvl="2" w:tplc="0409001B" w:tentative="1">
+      <w:start w:val="1"/>
+      <w:numFmt w:val="lowerRoman"/>
+      <w:lvlText w:val="%3."/>
+      <w:lvlJc w:val="right"/>
+      <w:pPr>
+        <w:ind w:left="2160" w:hanging="180"/>
+      </w:pPr>
+    </w:lvl>
+    <w:lvl w:ilvl="3" w:tplc="0409000F" w:tentative="1">
+      <w:start w:val="1"/>
+      <w:numFmt w:val="decimal"/>
+      <w:lvlText w:val="%4."/>
+      <w:lvlJc w:val="left"/>
+      <w:pPr>
+        <w:ind w:left="2880" w:hanging="360"/>
+      </w:pPr>
+    </w:lvl>
+    <w:lvl w:ilvl="4" w:tplc="04090019" w:tentative="1">
+      <w:start w:val="1"/>
+      <w:numFmt w:val="lowerLetter"/>
+      <w:lvlText w:val="%5."/>
+      <w:lvlJc w:val="left"/>
+      <w:pPr>
+        <w:ind w:left="3600" w:hanging="360"/>
+      </w:pPr>
+    </w:lvl>
+    <w:lvl w:ilvl="5" w:tplc="0409001B" w:tentative="1">
+      <w:start w:val="1"/>
+      <w:numFmt w:val="lowerRoman"/>
+      <w:lvlText w:val="%6."/>
+      <w:lvlJc w:val="right"/>
+      <w:pPr>
+        <w:ind w:left="4320" w:hanging="180"/>
+      </w:pPr>
+    </w:lvl>
+    <w:lvl w:ilvl="6" w:tplc="0409000F" w:tentative="1">
+      <w:start w:val="1"/>
+      <w:numFmt w:val="decimal"/>
+      <w:lvlText w:val="%7."/>
+      <w:lvlJc w:val="left"/>
+      <w:pPr>
+        <w:ind w:left="5040" w:hanging="360"/>
+      </w:pPr>
+    </w:lvl>
+    <w:lvl w:ilvl="7" w:tplc="04090019" w:tentative="1">
+      <w:start w:val="1"/>
+      <w:numFmt w:val="lowerLetter"/>
+      <w:lvlText w:val="%8."/>
+      <w:lvlJc w:val="left"/>
+      <w:pPr>
+        <w:ind w:left="5760" w:hanging="360"/>
+      </w:pPr>
+    </w:lvl>
+    <w:lvl w:ilvl="8" w:tplc="0409001B" w:tentative="1">
+      <w:start w:val="1"/>
+      <w:numFmt w:val="lowerRoman"/>
+      <w:lvlText w:val="%9."/>
+      <w:lvlJc w:val="right"/>
+      <w:pPr>
+        <w:ind w:left="6480" w:hanging="180"/>
+      </w:pPr>
+    </w:lvl>
+  </w:abstractNum>
+  <w:abstractNum w:abstractNumId="5" w15:restartNumberingAfterBreak="0">
+    <w:nsid w:val="39522F53"/>
+    <w:multiLevelType w:val="hybridMultilevel"/>
+    <w:tmpl w:val="438CD972"/>
+    <w:lvl w:ilvl="0" w:tplc="4AA6505C">
+      <w:start w:val="1"/>
+      <w:numFmt w:val="decimal"/>
+      <w:lvlText w:val="(%1)"/>
+      <w:lvlJc w:val="left"/>
+      <w:pPr>
+        <w:ind w:left="1080" w:hanging="360"/>
+      </w:pPr>
+      <w:rPr>
+        <w:rFonts w:hint="default"/>
+      </w:rPr>
+    </w:lvl>
+    <w:lvl w:ilvl="1" w:tplc="04090019">
+      <w:start w:val="1"/>
+      <w:numFmt w:val="lowerLetter"/>
+      <w:lvlText w:val="%2."/>
+      <w:lvlJc w:val="left"/>
+      <w:pPr>
+        <w:ind w:left="1800" w:hanging="360"/>
+      </w:pPr>
+    </w:lvl>
+    <w:lvl w:ilvl="2" w:tplc="0409001B" w:tentative="1">
+      <w:start w:val="1"/>
+      <w:numFmt w:val="lowerRoman"/>
+      <w:lvlText w:val="%3."/>
+      <w:lvlJc w:val="right"/>
+      <w:pPr>
+        <w:ind w:left="2520" w:hanging="180"/>
+      </w:pPr>
+    </w:lvl>
+    <w:lvl w:ilvl="3" w:tplc="0409000F" w:tentative="1">
+      <w:start w:val="1"/>
+      <w:numFmt w:val="decimal"/>
+      <w:lvlText w:val="%4."/>
+      <w:lvlJc w:val="left"/>
+      <w:pPr>
+        <w:ind w:left="3240" w:hanging="360"/>
+      </w:pPr>
+    </w:lvl>
+    <w:lvl w:ilvl="4" w:tplc="04090019" w:tentative="1">
+      <w:start w:val="1"/>
+      <w:numFmt w:val="lowerLetter"/>
+      <w:lvlText w:val="%5."/>
+      <w:lvlJc w:val="left"/>
+      <w:pPr>
+        <w:ind w:left="3960" w:hanging="360"/>
+      </w:pPr>
+    </w:lvl>
+    <w:lvl w:ilvl="5" w:tplc="0409001B" w:tentative="1">
+      <w:start w:val="1"/>
+      <w:numFmt w:val="lowerRoman"/>
+      <w:lvlText w:val="%6."/>
+      <w:lvlJc w:val="right"/>
+      <w:pPr>
+        <w:ind w:left="4680" w:hanging="180"/>
+      </w:pPr>
+    </w:lvl>
+    <w:lvl w:ilvl="6" w:tplc="0409000F" w:tentative="1">
+      <w:start w:val="1"/>
+      <w:numFmt w:val="decimal"/>
+      <w:lvlText w:val="%7."/>
+      <w:lvlJc w:val="left"/>
+      <w:pPr>
+        <w:ind w:left="5400" w:hanging="360"/>
+      </w:pPr>
+    </w:lvl>
+    <w:lvl w:ilvl="7" w:tplc="04090019" w:tentative="1">
+      <w:start w:val="1"/>
+      <w:numFmt w:val="lowerLetter"/>
+      <w:lvlText w:val="%8."/>
+      <w:lvlJc w:val="left"/>
+      <w:pPr>
+        <w:ind w:left="6120" w:hanging="360"/>
+      </w:pPr>
+    </w:lvl>
+    <w:lvl w:ilvl="8" w:tplc="0409001B" w:tentative="1">
+      <w:start w:val="1"/>
+      <w:numFmt w:val="lowerRoman"/>
+      <w:lvlText w:val="%9."/>
+      <w:lvlJc w:val="right"/>
+      <w:pPr>
+        <w:ind w:left="6840" w:hanging="180"/>
+      </w:pPr>
+    </w:lvl>
+  </w:abstractNum>
+  <w:abstractNum w:abstractNumId="6" w15:restartNumberingAfterBreak="0">
     <w:nsid w:val="3E0B7F40"/>
     <w:multiLevelType w:val="hybridMultilevel"/>
     <w:tmpl w:val="1F021190"/>
@@ -3206,7 +2846,7 @@
       </w:pPr>
     </w:lvl>
   </w:abstractNum>
-  <w:abstractNum w:abstractNumId="5" w15:restartNumberingAfterBreak="0">
+  <w:abstractNum w:abstractNumId="7" w15:restartNumberingAfterBreak="0">
     <w:nsid w:val="4B373106"/>
     <w:multiLevelType w:val="hybridMultilevel"/>
     <w:tmpl w:val="FADC9402"/>
@@ -3295,7 +2935,7 @@
       </w:pPr>
     </w:lvl>
   </w:abstractNum>
-  <w:abstractNum w:abstractNumId="6" w15:restartNumberingAfterBreak="0">
+  <w:abstractNum w:abstractNumId="8" w15:restartNumberingAfterBreak="0">
     <w:nsid w:val="4F647D1A"/>
     <w:multiLevelType w:val="hybridMultilevel"/>
     <w:tmpl w:val="96ACC884"/>
@@ -3384,7 +3024,274 @@
       </w:pPr>
     </w:lvl>
   </w:abstractNum>
-  <w:abstractNum w:abstractNumId="7" w15:restartNumberingAfterBreak="0">
+  <w:abstractNum w:abstractNumId="9" w15:restartNumberingAfterBreak="0">
+    <w:nsid w:val="57DC564F"/>
+    <w:multiLevelType w:val="hybridMultilevel"/>
+    <w:tmpl w:val="067E6A9A"/>
+    <w:lvl w:ilvl="0" w:tplc="60144358">
+      <w:start w:val="1"/>
+      <w:numFmt w:val="upperRoman"/>
+      <w:lvlText w:val="%1."/>
+      <w:lvlJc w:val="left"/>
+      <w:pPr>
+        <w:ind w:left="1080" w:hanging="720"/>
+      </w:pPr>
+      <w:rPr>
+        <w:rFonts w:hint="default"/>
+      </w:rPr>
+    </w:lvl>
+    <w:lvl w:ilvl="1" w:tplc="04090019" w:tentative="1">
+      <w:start w:val="1"/>
+      <w:numFmt w:val="lowerLetter"/>
+      <w:lvlText w:val="%2."/>
+      <w:lvlJc w:val="left"/>
+      <w:pPr>
+        <w:ind w:left="1440" w:hanging="360"/>
+      </w:pPr>
+    </w:lvl>
+    <w:lvl w:ilvl="2" w:tplc="0409001B" w:tentative="1">
+      <w:start w:val="1"/>
+      <w:numFmt w:val="lowerRoman"/>
+      <w:lvlText w:val="%3."/>
+      <w:lvlJc w:val="right"/>
+      <w:pPr>
+        <w:ind w:left="2160" w:hanging="180"/>
+      </w:pPr>
+    </w:lvl>
+    <w:lvl w:ilvl="3" w:tplc="0409000F" w:tentative="1">
+      <w:start w:val="1"/>
+      <w:numFmt w:val="decimal"/>
+      <w:lvlText w:val="%4."/>
+      <w:lvlJc w:val="left"/>
+      <w:pPr>
+        <w:ind w:left="2880" w:hanging="360"/>
+      </w:pPr>
+    </w:lvl>
+    <w:lvl w:ilvl="4" w:tplc="04090019" w:tentative="1">
+      <w:start w:val="1"/>
+      <w:numFmt w:val="lowerLetter"/>
+      <w:lvlText w:val="%5."/>
+      <w:lvlJc w:val="left"/>
+      <w:pPr>
+        <w:ind w:left="3600" w:hanging="360"/>
+      </w:pPr>
+    </w:lvl>
+    <w:lvl w:ilvl="5" w:tplc="0409001B" w:tentative="1">
+      <w:start w:val="1"/>
+      <w:numFmt w:val="lowerRoman"/>
+      <w:lvlText w:val="%6."/>
+      <w:lvlJc w:val="right"/>
+      <w:pPr>
+        <w:ind w:left="4320" w:hanging="180"/>
+      </w:pPr>
+    </w:lvl>
+    <w:lvl w:ilvl="6" w:tplc="0409000F" w:tentative="1">
+      <w:start w:val="1"/>
+      <w:numFmt w:val="decimal"/>
+      <w:lvlText w:val="%7."/>
+      <w:lvlJc w:val="left"/>
+      <w:pPr>
+        <w:ind w:left="5040" w:hanging="360"/>
+      </w:pPr>
+    </w:lvl>
+    <w:lvl w:ilvl="7" w:tplc="04090019" w:tentative="1">
+      <w:start w:val="1"/>
+      <w:numFmt w:val="lowerLetter"/>
+      <w:lvlText w:val="%8."/>
+      <w:lvlJc w:val="left"/>
+      <w:pPr>
+        <w:ind w:left="5760" w:hanging="360"/>
+      </w:pPr>
+    </w:lvl>
+    <w:lvl w:ilvl="8" w:tplc="0409001B" w:tentative="1">
+      <w:start w:val="1"/>
+      <w:numFmt w:val="lowerRoman"/>
+      <w:lvlText w:val="%9."/>
+      <w:lvlJc w:val="right"/>
+      <w:pPr>
+        <w:ind w:left="6480" w:hanging="180"/>
+      </w:pPr>
+    </w:lvl>
+  </w:abstractNum>
+  <w:abstractNum w:abstractNumId="10" w15:restartNumberingAfterBreak="0">
+    <w:nsid w:val="5F5453F1"/>
+    <w:multiLevelType w:val="hybridMultilevel"/>
+    <w:tmpl w:val="5E929AD0"/>
+    <w:lvl w:ilvl="0" w:tplc="75861650">
+      <w:start w:val="1"/>
+      <w:numFmt w:val="upperRoman"/>
+      <w:lvlText w:val="%1."/>
+      <w:lvlJc w:val="left"/>
+      <w:pPr>
+        <w:ind w:left="1080" w:hanging="720"/>
+      </w:pPr>
+      <w:rPr>
+        <w:rFonts w:hint="default"/>
+      </w:rPr>
+    </w:lvl>
+    <w:lvl w:ilvl="1" w:tplc="04090019" w:tentative="1">
+      <w:start w:val="1"/>
+      <w:numFmt w:val="lowerLetter"/>
+      <w:lvlText w:val="%2."/>
+      <w:lvlJc w:val="left"/>
+      <w:pPr>
+        <w:ind w:left="1440" w:hanging="360"/>
+      </w:pPr>
+    </w:lvl>
+    <w:lvl w:ilvl="2" w:tplc="0409001B" w:tentative="1">
+      <w:start w:val="1"/>
+      <w:numFmt w:val="lowerRoman"/>
+      <w:lvlText w:val="%3."/>
+      <w:lvlJc w:val="right"/>
+      <w:pPr>
+        <w:ind w:left="2160" w:hanging="180"/>
+      </w:pPr>
+    </w:lvl>
+    <w:lvl w:ilvl="3" w:tplc="0409000F" w:tentative="1">
+      <w:start w:val="1"/>
+      <w:numFmt w:val="decimal"/>
+      <w:lvlText w:val="%4."/>
+      <w:lvlJc w:val="left"/>
+      <w:pPr>
+        <w:ind w:left="2880" w:hanging="360"/>
+      </w:pPr>
+    </w:lvl>
+    <w:lvl w:ilvl="4" w:tplc="04090019" w:tentative="1">
+      <w:start w:val="1"/>
+      <w:numFmt w:val="lowerLetter"/>
+      <w:lvlText w:val="%5."/>
+      <w:lvlJc w:val="left"/>
+      <w:pPr>
+        <w:ind w:left="3600" w:hanging="360"/>
+      </w:pPr>
+    </w:lvl>
+    <w:lvl w:ilvl="5" w:tplc="0409001B" w:tentative="1">
+      <w:start w:val="1"/>
+      <w:numFmt w:val="lowerRoman"/>
+      <w:lvlText w:val="%6."/>
+      <w:lvlJc w:val="right"/>
+      <w:pPr>
+        <w:ind w:left="4320" w:hanging="180"/>
+      </w:pPr>
+    </w:lvl>
+    <w:lvl w:ilvl="6" w:tplc="0409000F" w:tentative="1">
+      <w:start w:val="1"/>
+      <w:numFmt w:val="decimal"/>
+      <w:lvlText w:val="%7."/>
+      <w:lvlJc w:val="left"/>
+      <w:pPr>
+        <w:ind w:left="5040" w:hanging="360"/>
+      </w:pPr>
+    </w:lvl>
+    <w:lvl w:ilvl="7" w:tplc="04090019" w:tentative="1">
+      <w:start w:val="1"/>
+      <w:numFmt w:val="lowerLetter"/>
+      <w:lvlText w:val="%8."/>
+      <w:lvlJc w:val="left"/>
+      <w:pPr>
+        <w:ind w:left="5760" w:hanging="360"/>
+      </w:pPr>
+    </w:lvl>
+    <w:lvl w:ilvl="8" w:tplc="0409001B" w:tentative="1">
+      <w:start w:val="1"/>
+      <w:numFmt w:val="lowerRoman"/>
+      <w:lvlText w:val="%9."/>
+      <w:lvlJc w:val="right"/>
+      <w:pPr>
+        <w:ind w:left="6480" w:hanging="180"/>
+      </w:pPr>
+    </w:lvl>
+  </w:abstractNum>
+  <w:abstractNum w:abstractNumId="11" w15:restartNumberingAfterBreak="0">
+    <w:nsid w:val="6E1579CA"/>
+    <w:multiLevelType w:val="hybridMultilevel"/>
+    <w:tmpl w:val="F684EA90"/>
+    <w:lvl w:ilvl="0" w:tplc="0409000F">
+      <w:start w:val="1"/>
+      <w:numFmt w:val="decimal"/>
+      <w:lvlText w:val="%1."/>
+      <w:lvlJc w:val="left"/>
+      <w:pPr>
+        <w:ind w:left="720" w:hanging="360"/>
+      </w:pPr>
+      <w:rPr>
+        <w:rFonts w:hint="default"/>
+      </w:rPr>
+    </w:lvl>
+    <w:lvl w:ilvl="1" w:tplc="04090019" w:tentative="1">
+      <w:start w:val="1"/>
+      <w:numFmt w:val="lowerLetter"/>
+      <w:lvlText w:val="%2."/>
+      <w:lvlJc w:val="left"/>
+      <w:pPr>
+        <w:ind w:left="1440" w:hanging="360"/>
+      </w:pPr>
+    </w:lvl>
+    <w:lvl w:ilvl="2" w:tplc="0409001B" w:tentative="1">
+      <w:start w:val="1"/>
+      <w:numFmt w:val="lowerRoman"/>
+      <w:lvlText w:val="%3."/>
+      <w:lvlJc w:val="right"/>
+      <w:pPr>
+        <w:ind w:left="2160" w:hanging="180"/>
+      </w:pPr>
+    </w:lvl>
+    <w:lvl w:ilvl="3" w:tplc="0409000F" w:tentative="1">
+      <w:start w:val="1"/>
+      <w:numFmt w:val="decimal"/>
+      <w:lvlText w:val="%4."/>
+      <w:lvlJc w:val="left"/>
+      <w:pPr>
+        <w:ind w:left="2880" w:hanging="360"/>
+      </w:pPr>
+    </w:lvl>
+    <w:lvl w:ilvl="4" w:tplc="04090019" w:tentative="1">
+      <w:start w:val="1"/>
+      <w:numFmt w:val="lowerLetter"/>
+      <w:lvlText w:val="%5."/>
+      <w:lvlJc w:val="left"/>
+      <w:pPr>
+        <w:ind w:left="3600" w:hanging="360"/>
+      </w:pPr>
+    </w:lvl>
+    <w:lvl w:ilvl="5" w:tplc="0409001B" w:tentative="1">
+      <w:start w:val="1"/>
+      <w:numFmt w:val="lowerRoman"/>
+      <w:lvlText w:val="%6."/>
+      <w:lvlJc w:val="right"/>
+      <w:pPr>
+        <w:ind w:left="4320" w:hanging="180"/>
+      </w:pPr>
+    </w:lvl>
+    <w:lvl w:ilvl="6" w:tplc="0409000F" w:tentative="1">
+      <w:start w:val="1"/>
+      <w:numFmt w:val="decimal"/>
+      <w:lvlText w:val="%7."/>
+      <w:lvlJc w:val="left"/>
+      <w:pPr>
+        <w:ind w:left="5040" w:hanging="360"/>
+      </w:pPr>
+    </w:lvl>
+    <w:lvl w:ilvl="7" w:tplc="04090019" w:tentative="1">
+      <w:start w:val="1"/>
+      <w:numFmt w:val="lowerLetter"/>
+      <w:lvlText w:val="%8."/>
+      <w:lvlJc w:val="left"/>
+      <w:pPr>
+        <w:ind w:left="5760" w:hanging="360"/>
+      </w:pPr>
+    </w:lvl>
+    <w:lvl w:ilvl="8" w:tplc="0409001B" w:tentative="1">
+      <w:start w:val="1"/>
+      <w:numFmt w:val="lowerRoman"/>
+      <w:lvlText w:val="%9."/>
+      <w:lvlJc w:val="right"/>
+      <w:pPr>
+        <w:ind w:left="6480" w:hanging="180"/>
+      </w:pPr>
+    </w:lvl>
+  </w:abstractNum>
+  <w:abstractNum w:abstractNumId="12" w15:restartNumberingAfterBreak="0">
     <w:nsid w:val="6F4E59A1"/>
     <w:multiLevelType w:val="hybridMultilevel"/>
     <w:tmpl w:val="A820808C"/>
@@ -3507,19 +3414,34 @@
     <w:abstractNumId w:val="1"/>
   </w:num>
   <w:num w:numId="4">
-    <w:abstractNumId w:val="5"/>
+    <w:abstractNumId w:val="7"/>
   </w:num>
   <w:num w:numId="5">
-    <w:abstractNumId w:val="7"/>
+    <w:abstractNumId w:val="12"/>
   </w:num>
   <w:num w:numId="6">
-    <w:abstractNumId w:val="6"/>
+    <w:abstractNumId w:val="8"/>
   </w:num>
   <w:num w:numId="7">
-    <w:abstractNumId w:val="4"/>
+    <w:abstractNumId w:val="6"/>
   </w:num>
   <w:num w:numId="8">
     <w:abstractNumId w:val="2"/>
+  </w:num>
+  <w:num w:numId="9">
+    <w:abstractNumId w:val="10"/>
+  </w:num>
+  <w:num w:numId="10">
+    <w:abstractNumId w:val="4"/>
+  </w:num>
+  <w:num w:numId="11">
+    <w:abstractNumId w:val="9"/>
+  </w:num>
+  <w:num w:numId="12">
+    <w:abstractNumId w:val="11"/>
+  </w:num>
+  <w:num w:numId="13">
+    <w:abstractNumId w:val="5"/>
   </w:num>
   <w:numIdMacAtCleanup w:val="5"/>
 </w:numbering>
@@ -5425,7 +5347,7 @@
 </file>
 
 <file path=customXml/itemProps2.xml><?xml version="1.0" encoding="utf-8"?>
-<ds:datastoreItem xmlns:ds="http://schemas.openxmlformats.org/officeDocument/2006/customXml" ds:itemID="{DB0E63C4-37CA-49D5-9A7F-58AC923DF4FE}">
+<ds:datastoreItem xmlns:ds="http://schemas.openxmlformats.org/officeDocument/2006/customXml" ds:itemID="{4FB0E994-1346-46C5-A5F3-A04D9DF901FA}">
   <ds:schemaRefs>
     <ds:schemaRef ds:uri="http://schemas.openxmlformats.org/officeDocument/2006/bibliography"/>
   </ds:schemaRefs>

</xml_diff>